<commit_message>
raport ai + coverege
</commit_message>
<xml_diff>
--- a/Testare Unitara In Python.docx
+++ b/Testare Unitara In Python.docx
@@ -1,6 +1,6 @@
 
 <file path=word/document.xml><?xml version="1.0" encoding="utf-8"?>
-<w:document xmlns:wpc="http://schemas.microsoft.com/office/word/2010/wordprocessingCanvas" xmlns:cx="http://schemas.microsoft.com/office/drawing/2014/chartex" xmlns:cx1="http://schemas.microsoft.com/office/drawing/2015/9/8/chartex" xmlns:cx2="http://schemas.microsoft.com/office/drawing/2015/10/21/chartex" xmlns:cx3="http://schemas.microsoft.com/office/drawing/2016/5/9/chartex" xmlns:cx4="http://schemas.microsoft.com/office/drawing/2016/5/10/chartex" xmlns:cx5="http://schemas.microsoft.com/office/drawing/2016/5/11/chartex" xmlns:cx6="http://schemas.microsoft.com/office/drawing/2016/5/12/chartex" xmlns:cx7="http://schemas.microsoft.com/office/drawing/2016/5/13/chartex" xmlns:cx8="http://schemas.microsoft.com/office/drawing/2016/5/14/chartex" xmlns:mc="http://schemas.openxmlformats.org/markup-compatibility/2006" xmlns:aink="http://schemas.microsoft.com/office/drawing/2016/ink" xmlns:am3d="http://schemas.microsoft.com/office/drawing/2017/model3d" xmlns:o="urn:schemas-microsoft-com:office:office" xmlns:oel="http://schemas.microsoft.com/office/2019/extlst" xmlns:r="http://schemas.openxmlformats.org/officeDocument/2006/relationships" xmlns:m="http://schemas.openxmlformats.org/officeDocument/2006/math" xmlns:v="urn:schemas-microsoft-com:vml" xmlns:wp14="http://schemas.microsoft.com/office/word/2010/wordprocessingDrawing" xmlns:wp="http://schemas.openxmlformats.org/drawingml/2006/wordprocessingDrawing" xmlns:w10="urn:schemas-microsoft-com:office:word" xmlns:w="http://schemas.openxmlformats.org/wordprocessingml/2006/main" xmlns:w14="http://schemas.microsoft.com/office/word/2010/wordml" xmlns:w15="http://schemas.microsoft.com/office/word/2012/wordml" xmlns:w16cex="http://schemas.microsoft.com/office/word/2018/wordml/cex" xmlns:w16cid="http://schemas.microsoft.com/office/word/2016/wordml/cid" xmlns:w16="http://schemas.microsoft.com/office/word/2018/wordml" xmlns:w16du="http://schemas.microsoft.com/office/word/2023/wordml/word16du" xmlns:w16sdtdh="http://schemas.microsoft.com/office/word/2020/wordml/sdtdatahash" xmlns:w16sdtfl="http://schemas.microsoft.com/office/word/2024/wordml/sdtformatlock" xmlns:w16se="http://schemas.microsoft.com/office/word/2015/wordml/symex" xmlns:wpg="http://schemas.microsoft.com/office/word/2010/wordprocessingGroup" xmlns:wpi="http://schemas.microsoft.com/office/word/2010/wordprocessingInk" xmlns:wne="http://schemas.microsoft.com/office/word/2006/wordml" xmlns:wps="http://schemas.microsoft.com/office/word/2010/wordprocessingShape" mc:Ignorable="w14 w15 w16se w16cid w16 w16cex w16sdtdh w16sdtfl w16du wp14">
+<w:document xmlns:wpc="http://schemas.microsoft.com/office/word/2010/wordprocessingCanvas" xmlns:cx="http://schemas.microsoft.com/office/drawing/2014/chartex" xmlns:cx1="http://schemas.microsoft.com/office/drawing/2015/9/8/chartex" xmlns:cx2="http://schemas.microsoft.com/office/drawing/2015/10/21/chartex" xmlns:cx3="http://schemas.microsoft.com/office/drawing/2016/5/9/chartex" xmlns:cx4="http://schemas.microsoft.com/office/drawing/2016/5/10/chartex" xmlns:cx5="http://schemas.microsoft.com/office/drawing/2016/5/11/chartex" xmlns:cx6="http://schemas.microsoft.com/office/drawing/2016/5/12/chartex" xmlns:cx7="http://schemas.microsoft.com/office/drawing/2016/5/13/chartex" xmlns:cx8="http://schemas.microsoft.com/office/drawing/2016/5/14/chartex" xmlns:mc="http://schemas.openxmlformats.org/markup-compatibility/2006" xmlns:aink="http://schemas.microsoft.com/office/drawing/2016/ink" xmlns:am3d="http://schemas.microsoft.com/office/drawing/2017/model3d" xmlns:o="urn:schemas-microsoft-com:office:office" xmlns:r="http://schemas.openxmlformats.org/officeDocument/2006/relationships" xmlns:m="http://schemas.openxmlformats.org/officeDocument/2006/math" xmlns:v="urn:schemas-microsoft-com:vml" xmlns:wp14="http://schemas.microsoft.com/office/word/2010/wordprocessingDrawing" xmlns:wp="http://schemas.openxmlformats.org/drawingml/2006/wordprocessingDrawing" xmlns:w10="urn:schemas-microsoft-com:office:word" xmlns:w="http://schemas.openxmlformats.org/wordprocessingml/2006/main" xmlns:w14="http://schemas.microsoft.com/office/word/2010/wordml" xmlns:w15="http://schemas.microsoft.com/office/word/2012/wordml" xmlns:w16cex="http://schemas.microsoft.com/office/word/2018/wordml/cex" xmlns:w16cid="http://schemas.microsoft.com/office/word/2016/wordml/cid" xmlns:w16="http://schemas.microsoft.com/office/word/2018/wordml" xmlns:w16sdtdh="http://schemas.microsoft.com/office/word/2020/wordml/sdtdatahash" xmlns:w16se="http://schemas.microsoft.com/office/word/2015/wordml/symex" xmlns:wpg="http://schemas.microsoft.com/office/word/2010/wordprocessingGroup" xmlns:wpi="http://schemas.microsoft.com/office/word/2010/wordprocessingInk" xmlns:wne="http://schemas.microsoft.com/office/word/2006/wordml" xmlns:wps="http://schemas.microsoft.com/office/word/2010/wordprocessingShape" mc:Ignorable="w14 w15 w16se w16cid w16 w16cex w16sdtdh wp14">
   <w:body>
     <w:p>
       <w:pPr>
@@ -3383,31 +3383,6 @@
     </w:p>
     <w:p>
       <w:pPr>
-        <w:ind w:left="360"/>
-        <w:rPr>
-          <w:rFonts w:ascii="Times New Roman" w:eastAsia="Times New Roman" w:hAnsi="Times New Roman" w:cs="Times New Roman"/>
-        </w:rPr>
-      </w:pPr>
-    </w:p>
-    <w:p>
-      <w:pPr>
-        <w:ind w:left="360"/>
-        <w:rPr>
-          <w:rFonts w:ascii="Times New Roman" w:eastAsia="Times New Roman" w:hAnsi="Times New Roman" w:cs="Times New Roman"/>
-        </w:rPr>
-      </w:pPr>
-    </w:p>
-    <w:p>
-      <w:pPr>
-        <w:ind w:left="360"/>
-        <w:rPr>
-          <w:rFonts w:ascii="Times New Roman" w:hAnsi="Times New Roman" w:cs="Times New Roman"/>
-        </w:rPr>
-      </w:pPr>
-    </w:p>
-    <w:p>
-      <w:pPr>
-        <w:ind w:left="360"/>
         <w:rPr>
           <w:rFonts w:ascii="Times New Roman" w:hAnsi="Times New Roman" w:cs="Times New Roman"/>
         </w:rPr>
@@ -3516,6 +3491,127 @@
         </w:rPr>
         <w:t>100% (Toate ramurile if/else au fost parcurse pe ambele logici, True și False).</w:t>
       </w:r>
+    </w:p>
+    <w:p>
+      <w:pPr>
+        <w:ind w:left="720"/>
+        <w:rPr>
+          <w:rFonts w:ascii="Times New Roman" w:hAnsi="Times New Roman" w:cs="Times New Roman"/>
+        </w:rPr>
+      </w:pPr>
+      <w:r>
+        <w:rPr>
+          <w:rFonts w:ascii="Times New Roman" w:hAnsi="Times New Roman" w:cs="Times New Roman"/>
+        </w:rPr>
+        <w:drawing>
+          <wp:inline distT="0" distB="0" distL="0" distR="0" wp14:anchorId="1012B8D6" wp14:editId="50E07FEC">
+            <wp:extent cx="5943600" cy="1934845"/>
+            <wp:effectExtent l="0" t="0" r="0" b="8255"/>
+            <wp:docPr id="2" name="Picture 2"/>
+            <wp:cNvGraphicFramePr>
+              <a:graphicFrameLocks xmlns:a="http://schemas.openxmlformats.org/drawingml/2006/main" noChangeAspect="1"/>
+            </wp:cNvGraphicFramePr>
+            <a:graphic xmlns:a="http://schemas.openxmlformats.org/drawingml/2006/main">
+              <a:graphicData uri="http://schemas.openxmlformats.org/drawingml/2006/picture">
+                <pic:pic xmlns:pic="http://schemas.openxmlformats.org/drawingml/2006/picture">
+                  <pic:nvPicPr>
+                    <pic:cNvPr id="1" name=""/>
+                    <pic:cNvPicPr/>
+                  </pic:nvPicPr>
+                  <pic:blipFill>
+                    <a:blip r:embed="rId11"/>
+                    <a:stretch>
+                      <a:fillRect/>
+                    </a:stretch>
+                  </pic:blipFill>
+                  <pic:spPr>
+                    <a:xfrm>
+                      <a:off x="0" y="0"/>
+                      <a:ext cx="5943600" cy="1934845"/>
+                    </a:xfrm>
+                    <a:prstGeom prst="rect">
+                      <a:avLst/>
+                    </a:prstGeom>
+                  </pic:spPr>
+                </pic:pic>
+              </a:graphicData>
+            </a:graphic>
+          </wp:inline>
+        </w:drawing>
+      </w:r>
+    </w:p>
+    <w:p>
+      <w:pPr>
+        <w:ind w:left="720"/>
+        <w:rPr>
+          <w:rStyle w:val="citation-198"/>
+          <w:rFonts w:ascii="Times New Roman" w:hAnsi="Times New Roman" w:cs="Times New Roman"/>
+        </w:rPr>
+      </w:pPr>
+      <w:r>
+        <w:rPr>
+          <w:rStyle w:val="citation-198"/>
+          <w:rFonts w:ascii="Times New Roman" w:hAnsi="Times New Roman" w:cs="Times New Roman"/>
+        </w:rPr>
+        <w:t>Se observă o acoperire de 100% pentru fișierul credit_validator.py. Acest lucru confirmă faptul că fiecare linie de cod din metoda evalueaza_eligibilitate a fost executată cel puțin o dată, inclusiv ramura de tratare a erorilor de tip (TypeError) și toate variantele de aprobare sau respingere a creditului.</w:t>
+      </w:r>
+    </w:p>
+    <w:p>
+      <w:pPr>
+        <w:ind w:left="720"/>
+        <w:rPr>
+          <w:rStyle w:val="citation-198"/>
+          <w:rFonts w:ascii="Times New Roman" w:hAnsi="Times New Roman" w:cs="Times New Roman"/>
+        </w:rPr>
+      </w:pPr>
+      <w:r>
+        <w:rPr>
+          <w:rStyle w:val="citation-198"/>
+          <w:rFonts w:ascii="Times New Roman" w:hAnsi="Times New Roman" w:cs="Times New Roman"/>
+        </w:rPr>
+        <w:drawing>
+          <wp:inline distT="0" distB="0" distL="0" distR="0" wp14:anchorId="2ABEAF86" wp14:editId="4252F0B1">
+            <wp:extent cx="4754880" cy="2863596"/>
+            <wp:effectExtent l="0" t="0" r="7620" b="0"/>
+            <wp:docPr id="3" name="Picture 3"/>
+            <wp:cNvGraphicFramePr>
+              <a:graphicFrameLocks xmlns:a="http://schemas.openxmlformats.org/drawingml/2006/main" noChangeAspect="1"/>
+            </wp:cNvGraphicFramePr>
+            <a:graphic xmlns:a="http://schemas.openxmlformats.org/drawingml/2006/main">
+              <a:graphicData uri="http://schemas.openxmlformats.org/drawingml/2006/picture">
+                <pic:pic xmlns:pic="http://schemas.openxmlformats.org/drawingml/2006/picture">
+                  <pic:nvPicPr>
+                    <pic:cNvPr id="1" name=""/>
+                    <pic:cNvPicPr/>
+                  </pic:nvPicPr>
+                  <pic:blipFill>
+                    <a:blip r:embed="rId12"/>
+                    <a:stretch>
+                      <a:fillRect/>
+                    </a:stretch>
+                  </pic:blipFill>
+                  <pic:spPr>
+                    <a:xfrm>
+                      <a:off x="0" y="0"/>
+                      <a:ext cx="4766561" cy="2870631"/>
+                    </a:xfrm>
+                    <a:prstGeom prst="rect">
+                      <a:avLst/>
+                    </a:prstGeom>
+                  </pic:spPr>
+                </pic:pic>
+              </a:graphicData>
+            </a:graphic>
+          </wp:inline>
+        </w:drawing>
+      </w:r>
+    </w:p>
+    <w:p>
+      <w:pPr>
+        <w:rPr>
+          <w:rFonts w:ascii="Times New Roman" w:hAnsi="Times New Roman" w:cs="Times New Roman"/>
+        </w:rPr>
+      </w:pPr>
     </w:p>
     <w:p>
       <w:pPr>
@@ -3762,7 +3858,6 @@
           <w:b/>
           <w:bCs/>
         </w:rPr>
-        <w:lastRenderedPageBreak/>
         <w:t>Mutanții Rămași în Urmă (Rularea cu Cosmic Ray)</w:t>
       </w:r>
     </w:p>
@@ -3776,6 +3871,7 @@
       <w:r>
         <w:rPr>
           <w:rFonts w:ascii="Times New Roman" w:hAnsi="Times New Roman" w:cs="Times New Roman"/>
+          <w:noProof/>
         </w:rPr>
         <w:drawing>
           <wp:inline distT="0" distB="0" distL="0" distR="0" wp14:anchorId="0D96C4F6" wp14:editId="4A87A90B">
@@ -3793,7 +3889,7 @@
                     <pic:cNvPicPr/>
                   </pic:nvPicPr>
                   <pic:blipFill>
-                    <a:blip r:embed="rId11"/>
+                    <a:blip r:embed="rId13"/>
                     <a:stretch>
                       <a:fillRect/>
                     </a:stretch>
@@ -3849,6 +3945,7 @@
           <w:b/>
           <w:bCs/>
         </w:rPr>
+        <w:lastRenderedPageBreak/>
         <w:t>Explicația supraviețuirii:</w:t>
       </w:r>
       <w:r>
@@ -3890,6 +3987,7 @@
       <w:r>
         <w:rPr>
           <w:rFonts w:ascii="Times New Roman" w:hAnsi="Times New Roman" w:cs="Times New Roman"/>
+          <w:noProof/>
         </w:rPr>
         <w:drawing>
           <wp:inline distT="0" distB="0" distL="0" distR="0" wp14:anchorId="2BB2D168" wp14:editId="2A66D93D">
@@ -3907,7 +4005,7 @@
                     <pic:cNvPicPr/>
                   </pic:nvPicPr>
                   <pic:blipFill>
-                    <a:blip r:embed="rId12"/>
+                    <a:blip r:embed="rId14"/>
                     <a:stretch>
                       <a:fillRect/>
                     </a:stretch>
@@ -3946,6 +4044,7 @@
       <w:r>
         <w:rPr>
           <w:rFonts w:ascii="Times New Roman" w:hAnsi="Times New Roman" w:cs="Times New Roman"/>
+          <w:noProof/>
         </w:rPr>
         <w:drawing>
           <wp:inline distT="0" distB="0" distL="0" distR="0" wp14:anchorId="220F9F3D" wp14:editId="6ABF57DD">
@@ -3963,7 +4062,7 @@
                     <pic:cNvPicPr/>
                   </pic:nvPicPr>
                   <pic:blipFill>
-                    <a:blip r:embed="rId13"/>
+                    <a:blip r:embed="rId15"/>
                     <a:stretch>
                       <a:fillRect/>
                     </a:stretch>
@@ -3994,8 +4093,8 @@
       <w:r>
         <w:rPr>
           <w:rFonts w:ascii="Times New Roman" w:hAnsi="Times New Roman" w:cs="Times New Roman"/>
-        </w:rPr>
-        <w:lastRenderedPageBreak/>
+          <w:noProof/>
+        </w:rPr>
         <w:drawing>
           <wp:inline distT="0" distB="0" distL="0" distR="0" wp14:anchorId="477F8B80" wp14:editId="3D59AEF9">
             <wp:extent cx="5943600" cy="1843405"/>
@@ -4012,7 +4111,7 @@
                     <pic:cNvPicPr/>
                   </pic:nvPicPr>
                   <pic:blipFill>
-                    <a:blip r:embed="rId14"/>
+                    <a:blip r:embed="rId16"/>
                     <a:stretch>
                       <a:fillRect/>
                     </a:stretch>
@@ -4088,7 +4187,14 @@
         <w:rPr>
           <w:rFonts w:ascii="Times New Roman" w:hAnsi="Times New Roman" w:cs="Times New Roman"/>
         </w:rPr>
-        <w:t xml:space="preserve"> Testele anterioare verificau tipurile de date doar pentru un singur parametru greșit pe rând (ex: doar vârsta invalidă, sau doar venitul invalid). Mutantul devine activ și oferă rezultate greșite dacă testăm o situație în care mai mulți parametri sunt invalizi simultan.</w:t>
+        <w:t xml:space="preserve"> Testele anterioare verificau tipurile de date doar pentru un singur parametru greșit pe rând (ex: doar vârsta invalidă, sau doar venitul invalid). Mutantul devine </w:t>
+      </w:r>
+      <w:r>
+        <w:rPr>
+          <w:rFonts w:ascii="Times New Roman" w:hAnsi="Times New Roman" w:cs="Times New Roman"/>
+        </w:rPr>
+        <w:lastRenderedPageBreak/>
+        <w:t>activ și oferă rezultate greșite dacă testăm o situație în care mai mulți parametri sunt invalizi simultan.</w:t>
       </w:r>
     </w:p>
     <w:p>
@@ -4123,6 +4229,7 @@
       <w:r>
         <w:rPr>
           <w:rFonts w:ascii="Times New Roman" w:hAnsi="Times New Roman" w:cs="Times New Roman"/>
+          <w:noProof/>
         </w:rPr>
         <w:drawing>
           <wp:inline distT="0" distB="0" distL="0" distR="0" wp14:anchorId="1A7F8453" wp14:editId="15ABB962">
@@ -4140,7 +4247,7 @@
                     <pic:cNvPicPr/>
                   </pic:nvPicPr>
                   <pic:blipFill>
-                    <a:blip r:embed="rId15"/>
+                    <a:blip r:embed="rId17"/>
                     <a:stretch>
                       <a:fillRect/>
                     </a:stretch>
@@ -4211,8 +4318,8 @@
       <w:r>
         <w:rPr>
           <w:rFonts w:ascii="Times New Roman" w:hAnsi="Times New Roman" w:cs="Times New Roman"/>
-        </w:rPr>
-        <w:lastRenderedPageBreak/>
+          <w:noProof/>
+        </w:rPr>
         <w:drawing>
           <wp:inline distT="0" distB="0" distL="0" distR="0" wp14:anchorId="3C6E80C2" wp14:editId="764E58FB">
             <wp:extent cx="3696216" cy="685896"/>
@@ -4229,7 +4336,7 @@
                     <pic:cNvPicPr/>
                   </pic:nvPicPr>
                   <pic:blipFill>
-                    <a:blip r:embed="rId16"/>
+                    <a:blip r:embed="rId18"/>
                     <a:stretch>
                       <a:fillRect/>
                     </a:stretch>
@@ -4259,6 +4366,423 @@
           <w:bCs/>
         </w:rPr>
       </w:pPr>
+      <w:r>
+        <w:rPr>
+          <w:rFonts w:ascii="Times New Roman" w:hAnsi="Times New Roman" w:cs="Times New Roman"/>
+          <w:b/>
+          <w:bCs/>
+        </w:rPr>
+        <w:t>Raport AI</w:t>
+      </w:r>
+    </w:p>
+    <w:p>
+      <w:pPr>
+        <w:pStyle w:val="NormalWeb"/>
+        <w:ind w:firstLine="360"/>
+      </w:pPr>
+      <w:r>
+        <w:t>În cadrul acestui proiect, Inteligența Artificială a fost utilizată ca instrument de suport pentru optimizarea setului de teste unitare și pentru interpretarea rezultatelor de acoperire a codului.</w:t>
+      </w:r>
+    </w:p>
+    <w:p>
+      <w:pPr>
+        <w:pStyle w:val="NormalWeb"/>
+      </w:pPr>
+      <w:r>
+        <w:rPr>
+          <w:rStyle w:val="citation-227"/>
+          <w:rFonts w:eastAsiaTheme="majorEastAsia"/>
+        </w:rPr>
+        <w:t>AI-ul a fost utilizat pentru a identifica vulnerabilități în Drumul 1 (Eroare) al grafului de control</w:t>
+      </w:r>
+      <w:r>
+        <w:t xml:space="preserve">. Deși logica de business era acoperită, AI-ul a sugerat adăugarea testelor pentru: </w:t>
+      </w:r>
+    </w:p>
+    <w:p>
+      <w:pPr>
+        <w:pStyle w:val="NormalWeb"/>
+        <w:numPr>
+          <w:ilvl w:val="0"/>
+          <w:numId w:val="21"/>
+        </w:numPr>
+      </w:pPr>
+      <w:r>
+        <w:t>Valori de tip NoneType: Verificarea comportamentului când un câmp este lăsat gol.</w:t>
+      </w:r>
+    </w:p>
+    <w:p>
+      <w:pPr>
+        <w:pStyle w:val="NormalWeb"/>
+        <w:numPr>
+          <w:ilvl w:val="0"/>
+          <w:numId w:val="21"/>
+        </w:numPr>
+      </w:pPr>
+      <w:r>
+        <w:t>Tipuri complexe (liste/obiecte): Asigurarea că doar valorile numerice sunt procesate.</w:t>
+      </w:r>
+    </w:p>
+    <w:p>
+      <w:pPr>
+        <w:pStyle w:val="NormalWeb"/>
+        <w:numPr>
+          <w:ilvl w:val="0"/>
+          <w:numId w:val="21"/>
+        </w:numPr>
+      </w:pPr>
+      <w:r>
+        <w:t>Parametri lipsă: Testarea robusteții</w:t>
+      </w:r>
+      <w:r>
+        <w:t xml:space="preserve"> funcției la apeluri incomplete.</w:t>
+      </w:r>
+    </w:p>
+    <w:p>
+      <w:pPr>
+        <w:pStyle w:val="NormalWeb"/>
+      </w:pPr>
+    </w:p>
+    <w:p>
+      <w:pPr>
+        <w:pStyle w:val="NormalWeb"/>
+      </w:pPr>
+      <w:r>
+        <w:t>Optimizarea pentru Mutation Testing</w:t>
+      </w:r>
+    </w:p>
+    <w:p>
+      <w:pPr>
+        <w:pStyle w:val="NormalWeb"/>
+        <w:ind w:firstLine="360"/>
+      </w:pPr>
+      <w:r>
+        <w:t xml:space="preserve">În urma analizei inițiale cu </w:t>
+      </w:r>
+      <w:r>
+        <w:rPr>
+          <w:rStyle w:val="HTMLCode"/>
+          <w:rFonts w:eastAsiaTheme="majorEastAsia"/>
+        </w:rPr>
+        <w:t>mutmut</w:t>
+      </w:r>
+      <w:r>
+        <w:t xml:space="preserve">, au fost identificați mutanți supraviețuitori la nivelul operatorilor de comparație (ex: </w:t>
+      </w:r>
+      <w:r>
+        <w:rPr>
+          <w:rStyle w:val="HTMLCode"/>
+          <w:rFonts w:eastAsiaTheme="majorEastAsia"/>
+        </w:rPr>
+        <w:t>&gt;</w:t>
+      </w:r>
+      <w:r>
+        <w:t xml:space="preserve"> transformat în </w:t>
+      </w:r>
+      <w:r>
+        <w:rPr>
+          <w:rStyle w:val="HTMLCode"/>
+          <w:rFonts w:eastAsiaTheme="majorEastAsia"/>
+        </w:rPr>
+        <w:t>&gt;=</w:t>
+      </w:r>
+      <w:r>
+        <w:t xml:space="preserve">). </w:t>
+      </w:r>
+      <w:r>
+        <w:rPr>
+          <w:rStyle w:val="citation-226"/>
+          <w:rFonts w:eastAsiaTheme="majorEastAsia"/>
+        </w:rPr>
+        <w:t xml:space="preserve">AI-ul a propus tehnica </w:t>
+      </w:r>
+      <w:r>
+        <w:rPr>
+          <w:rStyle w:val="citation-226"/>
+          <w:rFonts w:eastAsiaTheme="majorEastAsia"/>
+          <w:b/>
+          <w:bCs/>
+        </w:rPr>
+        <w:t>BVA (Boundary Value Analysis)</w:t>
+      </w:r>
+      <w:r>
+        <w:rPr>
+          <w:rStyle w:val="citation-226"/>
+          <w:rFonts w:eastAsiaTheme="majorEastAsia"/>
+        </w:rPr>
+        <w:t xml:space="preserve"> la nivel de cod</w:t>
+      </w:r>
+      <w:r>
+        <w:t xml:space="preserve">: </w:t>
+      </w:r>
+    </w:p>
+    <w:p>
+      <w:pPr>
+        <w:pStyle w:val="NormalWeb"/>
+        <w:numPr>
+          <w:ilvl w:val="0"/>
+          <w:numId w:val="22"/>
+        </w:numPr>
+      </w:pPr>
+      <w:r>
+        <w:rPr>
+          <w:rStyle w:val="citation-225"/>
+          <w:rFonts w:eastAsiaTheme="majorEastAsia"/>
+        </w:rPr>
+        <w:lastRenderedPageBreak/>
+        <w:t>Adăugarea testelor pe valorile de frontieră exactă: 500, 800, 2000</w:t>
+      </w:r>
+      <w:r>
+        <w:t xml:space="preserve">. </w:t>
+      </w:r>
+    </w:p>
+    <w:p>
+      <w:pPr>
+        <w:pStyle w:val="NormalWeb"/>
+        <w:numPr>
+          <w:ilvl w:val="0"/>
+          <w:numId w:val="22"/>
+        </w:numPr>
+      </w:pPr>
+      <w:r>
+        <w:rPr>
+          <w:rStyle w:val="citation-224"/>
+          <w:rFonts w:eastAsiaTheme="majorEastAsia"/>
+        </w:rPr>
+        <w:t>Această intervenție a permis "uciderea" mutanților și creșterea calității testelor de la o simplă verificare a succesului la o validare riguroasă a limitelor</w:t>
+      </w:r>
+      <w:r>
+        <w:t xml:space="preserve">. </w:t>
+      </w:r>
+    </w:p>
+    <w:p>
+      <w:pPr>
+        <w:ind w:left="360"/>
+        <w:rPr>
+          <w:rFonts w:ascii="Times New Roman" w:hAnsi="Times New Roman" w:cs="Times New Roman"/>
+          <w:b/>
+          <w:bCs/>
+          <w:i/>
+          <w:iCs/>
+        </w:rPr>
+      </w:pPr>
+      <w:r>
+        <w:rPr>
+          <w:rFonts w:ascii="Times New Roman" w:hAnsi="Times New Roman" w:cs="Times New Roman"/>
+        </w:rPr>
+        <w:t>Exemplu de prompt</w:t>
+      </w:r>
+      <w:r>
+        <w:rPr>
+          <w:rFonts w:ascii="Times New Roman" w:hAnsi="Times New Roman" w:cs="Times New Roman"/>
+        </w:rPr>
+        <w:t>:</w:t>
+      </w:r>
+      <w:r>
+        <w:rPr>
+          <w:rFonts w:ascii="Times New Roman" w:hAnsi="Times New Roman" w:cs="Times New Roman"/>
+        </w:rPr>
+        <w:br/>
+      </w:r>
+      <w:r>
+        <w:rPr>
+          <w:rFonts w:ascii="Times New Roman" w:hAnsi="Times New Roman" w:cs="Times New Roman"/>
+          <w:b/>
+          <w:bCs/>
+          <w:i/>
+          <w:iCs/>
+        </w:rPr>
+        <w:t xml:space="preserve">"Am o funcție în Python numită </w:t>
+      </w:r>
+      <w:r>
+        <w:rPr>
+          <w:rStyle w:val="HTMLCode"/>
+          <w:rFonts w:ascii="Times New Roman" w:eastAsiaTheme="majorEastAsia" w:hAnsi="Times New Roman" w:cs="Times New Roman"/>
+          <w:b/>
+          <w:bCs/>
+          <w:i/>
+          <w:iCs/>
+        </w:rPr>
+        <w:t>evalueaza_eligibilitate(varsta, venit, scor)</w:t>
+      </w:r>
+      <w:r>
+        <w:rPr>
+          <w:rFonts w:ascii="Times New Roman" w:hAnsi="Times New Roman" w:cs="Times New Roman"/>
+          <w:b/>
+          <w:bCs/>
+          <w:i/>
+          <w:iCs/>
+        </w:rPr>
+        <w:t xml:space="preserve">. Am observat că la Mutation Testing, mutanții care schimbă </w:t>
+      </w:r>
+      <w:r>
+        <w:rPr>
+          <w:rStyle w:val="HTMLCode"/>
+          <w:rFonts w:ascii="Times New Roman" w:eastAsiaTheme="majorEastAsia" w:hAnsi="Times New Roman" w:cs="Times New Roman"/>
+          <w:b/>
+          <w:bCs/>
+          <w:i/>
+          <w:iCs/>
+        </w:rPr>
+        <w:t>scor_credit &gt; 500</w:t>
+      </w:r>
+      <w:r>
+        <w:rPr>
+          <w:rFonts w:ascii="Times New Roman" w:hAnsi="Times New Roman" w:cs="Times New Roman"/>
+          <w:b/>
+          <w:bCs/>
+          <w:i/>
+          <w:iCs/>
+        </w:rPr>
+        <w:t xml:space="preserve"> în </w:t>
+      </w:r>
+      <w:r>
+        <w:rPr>
+          <w:rStyle w:val="HTMLCode"/>
+          <w:rFonts w:ascii="Times New Roman" w:eastAsiaTheme="majorEastAsia" w:hAnsi="Times New Roman" w:cs="Times New Roman"/>
+          <w:b/>
+          <w:bCs/>
+          <w:i/>
+          <w:iCs/>
+        </w:rPr>
+        <w:t>scor_credit &gt;= 500</w:t>
+      </w:r>
+      <w:r>
+        <w:rPr>
+          <w:rFonts w:ascii="Times New Roman" w:hAnsi="Times New Roman" w:cs="Times New Roman"/>
+          <w:b/>
+          <w:bCs/>
+          <w:i/>
+          <w:iCs/>
+        </w:rPr>
+        <w:t xml:space="preserve"> supraviețuiesc. Generează-mi un test unitar specific care să 'ucidă' acest mutant și explică-mi de ce este importantă valoarea de frontieră 500 în acest context."</w:t>
+      </w:r>
+    </w:p>
+    <w:p>
+      <w:pPr>
+        <w:ind w:left="360"/>
+        <w:rPr>
+          <w:rFonts w:ascii="Times New Roman" w:hAnsi="Times New Roman" w:cs="Times New Roman"/>
+        </w:rPr>
+      </w:pPr>
+      <w:r>
+        <w:rPr>
+          <w:rFonts w:ascii="Times New Roman" w:hAnsi="Times New Roman" w:cs="Times New Roman"/>
+        </w:rPr>
+        <w:t>Cod AI:</w:t>
+      </w:r>
+    </w:p>
+    <w:p>
+      <w:pPr>
+        <w:ind w:left="360"/>
+        <w:rPr>
+          <w:rFonts w:ascii="Times New Roman" w:hAnsi="Times New Roman" w:cs="Times New Roman"/>
+        </w:rPr>
+      </w:pPr>
+      <w:r>
+        <w:rPr>
+          <w:rFonts w:ascii="Times New Roman" w:hAnsi="Times New Roman" w:cs="Times New Roman"/>
+        </w:rPr>
+        <w:t>def test_mutant_scor_limita_inferioara_exact(self):</w:t>
+      </w:r>
+    </w:p>
+    <w:p>
+      <w:pPr>
+        <w:ind w:left="360"/>
+        <w:rPr>
+          <w:rFonts w:ascii="Times New Roman" w:hAnsi="Times New Roman" w:cs="Times New Roman"/>
+        </w:rPr>
+      </w:pPr>
+      <w:r>
+        <w:rPr>
+          <w:rFonts w:ascii="Times New Roman" w:hAnsi="Times New Roman" w:cs="Times New Roman"/>
+        </w:rPr>
+        <w:t xml:space="preserve">    """</w:t>
+      </w:r>
+    </w:p>
+    <w:p>
+      <w:pPr>
+        <w:ind w:left="360"/>
+        <w:rPr>
+          <w:rFonts w:ascii="Times New Roman" w:hAnsi="Times New Roman" w:cs="Times New Roman"/>
+        </w:rPr>
+      </w:pPr>
+      <w:r>
+        <w:rPr>
+          <w:rFonts w:ascii="Times New Roman" w:hAnsi="Times New Roman" w:cs="Times New Roman"/>
+        </w:rPr>
+        <w:t xml:space="preserve">    Acest test verifică exact valoarea de 500. </w:t>
+      </w:r>
+    </w:p>
+    <w:p>
+      <w:pPr>
+        <w:ind w:left="360"/>
+        <w:rPr>
+          <w:rFonts w:ascii="Times New Roman" w:hAnsi="Times New Roman" w:cs="Times New Roman"/>
+        </w:rPr>
+      </w:pPr>
+      <w:r>
+        <w:rPr>
+          <w:rFonts w:ascii="Times New Roman" w:hAnsi="Times New Roman" w:cs="Times New Roman"/>
+        </w:rPr>
+        <w:t xml:space="preserve">    Conform cerințelor, scorul trebuie să fie STRICT mai mare de 500.</w:t>
+      </w:r>
+    </w:p>
+    <w:p>
+      <w:pPr>
+        <w:ind w:left="360"/>
+        <w:rPr>
+          <w:rFonts w:ascii="Times New Roman" w:hAnsi="Times New Roman" w:cs="Times New Roman"/>
+        </w:rPr>
+      </w:pPr>
+      <w:r>
+        <w:rPr>
+          <w:rFonts w:ascii="Times New Roman" w:hAnsi="Times New Roman" w:cs="Times New Roman"/>
+        </w:rPr>
+        <w:t xml:space="preserve">    Dacă scorul este 500, rezultatul TREBUIE să fie 'Respins'.</w:t>
+      </w:r>
+    </w:p>
+    <w:p>
+      <w:pPr>
+        <w:ind w:left="360"/>
+        <w:rPr>
+          <w:rFonts w:ascii="Times New Roman" w:hAnsi="Times New Roman" w:cs="Times New Roman"/>
+        </w:rPr>
+      </w:pPr>
+      <w:r>
+        <w:rPr>
+          <w:rFonts w:ascii="Times New Roman" w:hAnsi="Times New Roman" w:cs="Times New Roman"/>
+        </w:rPr>
+        <w:t xml:space="preserve">    """</w:t>
+      </w:r>
+    </w:p>
+    <w:p>
+      <w:pPr>
+        <w:ind w:left="360"/>
+        <w:rPr>
+          <w:rFonts w:ascii="Times New Roman" w:hAnsi="Times New Roman" w:cs="Times New Roman"/>
+        </w:rPr>
+      </w:pPr>
+      <w:r>
+        <w:rPr>
+          <w:rFonts w:ascii="Times New Roman" w:hAnsi="Times New Roman" w:cs="Times New Roman"/>
+        </w:rPr>
+        <w:t xml:space="preserve">    rezultat = self.validator.evalueaza_eligibilitate(30, 3000, 500)</w:t>
+      </w:r>
+    </w:p>
+    <w:p>
+      <w:pPr>
+        <w:ind w:left="360"/>
+        <w:rPr>
+          <w:rFonts w:ascii="Times New Roman" w:hAnsi="Times New Roman" w:cs="Times New Roman"/>
+        </w:rPr>
+      </w:pPr>
+      <w:r>
+        <w:rPr>
+          <w:rFonts w:ascii="Times New Roman" w:hAnsi="Times New Roman" w:cs="Times New Roman"/>
+        </w:rPr>
+        <w:t xml:space="preserve">    self.assertEqual(rezultat, "Respins: Scor sau venit insuficient")</w:t>
+      </w:r>
     </w:p>
     <w:p>
       <w:pPr>
@@ -4984,20 +5508,6 @@
         <w:ind w:left="360"/>
         <w:rPr>
           <w:rFonts w:ascii="Times New Roman" w:hAnsi="Times New Roman" w:cs="Times New Roman"/>
-        </w:rPr>
-      </w:pPr>
-      <w:r>
-        <w:rPr>
-          <w:rFonts w:ascii="Times New Roman" w:hAnsi="Times New Roman" w:cs="Times New Roman"/>
-        </w:rPr>
-        <w:t>De adaugat cosmic-ray ca tool</w:t>
-      </w:r>
-    </w:p>
-    <w:p>
-      <w:pPr>
-        <w:ind w:left="360"/>
-        <w:rPr>
-          <w:rFonts w:ascii="Times New Roman" w:hAnsi="Times New Roman" w:cs="Times New Roman"/>
           <w:b/>
           <w:bCs/>
         </w:rPr>
@@ -5044,7 +5554,7 @@
           <w:iCs/>
         </w:rPr>
       </w:pPr>
-      <w:hyperlink r:id="rId17" w:history="1">
+      <w:hyperlink r:id="rId19" w:history="1">
         <w:r>
           <w:rPr>
             <w:rStyle w:val="Hyperlink"/>
@@ -5069,7 +5579,7 @@
           <w:iCs/>
         </w:rPr>
       </w:pPr>
-      <w:hyperlink r:id="rId18" w:history="1">
+      <w:hyperlink r:id="rId20" w:history="1">
         <w:r>
           <w:rPr>
             <w:rStyle w:val="Hyperlink"/>
@@ -5094,7 +5604,7 @@
           <w:iCs/>
         </w:rPr>
       </w:pPr>
-      <w:hyperlink r:id="rId19" w:history="1">
+      <w:hyperlink r:id="rId21" w:history="1">
         <w:r>
           <w:rPr>
             <w:rStyle w:val="Hyperlink"/>
@@ -5119,7 +5629,7 @@
           <w:iCs/>
         </w:rPr>
       </w:pPr>
-      <w:hyperlink r:id="rId20" w:history="1">
+      <w:hyperlink r:id="rId22" w:history="1">
         <w:r>
           <w:rPr>
             <w:rStyle w:val="Hyperlink"/>
@@ -5134,10 +5644,6 @@
     <w:p>
       <w:pPr>
         <w:pStyle w:val="ListParagraph"/>
-        <w:numPr>
-          <w:ilvl w:val="0"/>
-          <w:numId w:val="8"/>
-        </w:numPr>
         <w:rPr>
           <w:rFonts w:ascii="Times New Roman" w:hAnsi="Times New Roman" w:cs="Times New Roman"/>
           <w:i/>
@@ -5175,8 +5681,157 @@
 </file>
 
 <file path=word/numbering.xml><?xml version="1.0" encoding="utf-8"?>
-<w:numbering xmlns:wpc="http://schemas.microsoft.com/office/word/2010/wordprocessingCanvas" xmlns:cx="http://schemas.microsoft.com/office/drawing/2014/chartex" xmlns:cx1="http://schemas.microsoft.com/office/drawing/2015/9/8/chartex" xmlns:cx2="http://schemas.microsoft.com/office/drawing/2015/10/21/chartex" xmlns:cx3="http://schemas.microsoft.com/office/drawing/2016/5/9/chartex" xmlns:cx4="http://schemas.microsoft.com/office/drawing/2016/5/10/chartex" xmlns:cx5="http://schemas.microsoft.com/office/drawing/2016/5/11/chartex" xmlns:cx6="http://schemas.microsoft.com/office/drawing/2016/5/12/chartex" xmlns:cx7="http://schemas.microsoft.com/office/drawing/2016/5/13/chartex" xmlns:cx8="http://schemas.microsoft.com/office/drawing/2016/5/14/chartex" xmlns:mc="http://schemas.openxmlformats.org/markup-compatibility/2006" xmlns:aink="http://schemas.microsoft.com/office/drawing/2016/ink" xmlns:am3d="http://schemas.microsoft.com/office/drawing/2017/model3d" xmlns:o="urn:schemas-microsoft-com:office:office" xmlns:oel="http://schemas.microsoft.com/office/2019/extlst" xmlns:r="http://schemas.openxmlformats.org/officeDocument/2006/relationships" xmlns:m="http://schemas.openxmlformats.org/officeDocument/2006/math" xmlns:v="urn:schemas-microsoft-com:vml" xmlns:wp14="http://schemas.microsoft.com/office/word/2010/wordprocessingDrawing" xmlns:wp="http://schemas.openxmlformats.org/drawingml/2006/wordprocessingDrawing" xmlns:w10="urn:schemas-microsoft-com:office:word" xmlns:w="http://schemas.openxmlformats.org/wordprocessingml/2006/main" xmlns:w14="http://schemas.microsoft.com/office/word/2010/wordml" xmlns:w15="http://schemas.microsoft.com/office/word/2012/wordml" xmlns:w16cex="http://schemas.microsoft.com/office/word/2018/wordml/cex" xmlns:w16cid="http://schemas.microsoft.com/office/word/2016/wordml/cid" xmlns:w16="http://schemas.microsoft.com/office/word/2018/wordml" xmlns:w16du="http://schemas.microsoft.com/office/word/2023/wordml/word16du" xmlns:w16sdtdh="http://schemas.microsoft.com/office/word/2020/wordml/sdtdatahash" xmlns:w16sdtfl="http://schemas.microsoft.com/office/word/2024/wordml/sdtformatlock" xmlns:w16se="http://schemas.microsoft.com/office/word/2015/wordml/symex" xmlns:wpg="http://schemas.microsoft.com/office/word/2010/wordprocessingGroup" xmlns:wpi="http://schemas.microsoft.com/office/word/2010/wordprocessingInk" xmlns:wne="http://schemas.microsoft.com/office/word/2006/wordml" xmlns:wps="http://schemas.microsoft.com/office/word/2010/wordprocessingShape" mc:Ignorable="w14 w15 w16se w16cid w16 w16cex w16sdtdh w16sdtfl w16du wp14">
+<w:numbering xmlns:wpc="http://schemas.microsoft.com/office/word/2010/wordprocessingCanvas" xmlns:cx="http://schemas.microsoft.com/office/drawing/2014/chartex" xmlns:cx1="http://schemas.microsoft.com/office/drawing/2015/9/8/chartex" xmlns:cx2="http://schemas.microsoft.com/office/drawing/2015/10/21/chartex" xmlns:cx3="http://schemas.microsoft.com/office/drawing/2016/5/9/chartex" xmlns:cx4="http://schemas.microsoft.com/office/drawing/2016/5/10/chartex" xmlns:cx5="http://schemas.microsoft.com/office/drawing/2016/5/11/chartex" xmlns:cx6="http://schemas.microsoft.com/office/drawing/2016/5/12/chartex" xmlns:cx7="http://schemas.microsoft.com/office/drawing/2016/5/13/chartex" xmlns:cx8="http://schemas.microsoft.com/office/drawing/2016/5/14/chartex" xmlns:mc="http://schemas.openxmlformats.org/markup-compatibility/2006" xmlns:aink="http://schemas.microsoft.com/office/drawing/2016/ink" xmlns:am3d="http://schemas.microsoft.com/office/drawing/2017/model3d" xmlns:o="urn:schemas-microsoft-com:office:office" xmlns:r="http://schemas.openxmlformats.org/officeDocument/2006/relationships" xmlns:m="http://schemas.openxmlformats.org/officeDocument/2006/math" xmlns:v="urn:schemas-microsoft-com:vml" xmlns:wp14="http://schemas.microsoft.com/office/word/2010/wordprocessingDrawing" xmlns:wp="http://schemas.openxmlformats.org/drawingml/2006/wordprocessingDrawing" xmlns:w10="urn:schemas-microsoft-com:office:word" xmlns:w="http://schemas.openxmlformats.org/wordprocessingml/2006/main" xmlns:w14="http://schemas.microsoft.com/office/word/2010/wordml" xmlns:w15="http://schemas.microsoft.com/office/word/2012/wordml" xmlns:w16cex="http://schemas.microsoft.com/office/word/2018/wordml/cex" xmlns:w16cid="http://schemas.microsoft.com/office/word/2016/wordml/cid" xmlns:w16="http://schemas.microsoft.com/office/word/2018/wordml" xmlns:w16sdtdh="http://schemas.microsoft.com/office/word/2020/wordml/sdtdatahash" xmlns:w16se="http://schemas.microsoft.com/office/word/2015/wordml/symex" xmlns:wpg="http://schemas.microsoft.com/office/word/2010/wordprocessingGroup" xmlns:wpi="http://schemas.microsoft.com/office/word/2010/wordprocessingInk" xmlns:wne="http://schemas.microsoft.com/office/word/2006/wordml" xmlns:wps="http://schemas.microsoft.com/office/word/2010/wordprocessingShape" mc:Ignorable="w14 w15 w16se w16cid w16 w16cex w16sdtdh wp14">
   <w:abstractNum w:abstractNumId="0" w15:restartNumberingAfterBreak="0">
+    <w:nsid w:val="02EC4AF1"/>
+    <w:multiLevelType w:val="multilevel"/>
+    <w:tmpl w:val="6AD4AB42"/>
+    <w:lvl w:ilvl="0">
+      <w:start w:val="1"/>
+      <w:numFmt w:val="bullet"/>
+      <w:lvlText w:val=""/>
+      <w:lvlJc w:val="left"/>
+      <w:pPr>
+        <w:tabs>
+          <w:tab w:val="num" w:pos="720"/>
+        </w:tabs>
+        <w:ind w:left="720" w:hanging="360"/>
+      </w:pPr>
+      <w:rPr>
+        <w:rFonts w:ascii="Symbol" w:hAnsi="Symbol" w:hint="default"/>
+        <w:sz w:val="20"/>
+      </w:rPr>
+    </w:lvl>
+    <w:lvl w:ilvl="1" w:tentative="1">
+      <w:start w:val="1"/>
+      <w:numFmt w:val="bullet"/>
+      <w:lvlText w:val="o"/>
+      <w:lvlJc w:val="left"/>
+      <w:pPr>
+        <w:tabs>
+          <w:tab w:val="num" w:pos="1440"/>
+        </w:tabs>
+        <w:ind w:left="1440" w:hanging="360"/>
+      </w:pPr>
+      <w:rPr>
+        <w:rFonts w:ascii="Courier New" w:hAnsi="Courier New" w:hint="default"/>
+        <w:sz w:val="20"/>
+      </w:rPr>
+    </w:lvl>
+    <w:lvl w:ilvl="2" w:tentative="1">
+      <w:start w:val="1"/>
+      <w:numFmt w:val="bullet"/>
+      <w:lvlText w:val=""/>
+      <w:lvlJc w:val="left"/>
+      <w:pPr>
+        <w:tabs>
+          <w:tab w:val="num" w:pos="2160"/>
+        </w:tabs>
+        <w:ind w:left="2160" w:hanging="360"/>
+      </w:pPr>
+      <w:rPr>
+        <w:rFonts w:ascii="Wingdings" w:hAnsi="Wingdings" w:hint="default"/>
+        <w:sz w:val="20"/>
+      </w:rPr>
+    </w:lvl>
+    <w:lvl w:ilvl="3" w:tentative="1">
+      <w:start w:val="1"/>
+      <w:numFmt w:val="bullet"/>
+      <w:lvlText w:val=""/>
+      <w:lvlJc w:val="left"/>
+      <w:pPr>
+        <w:tabs>
+          <w:tab w:val="num" w:pos="2880"/>
+        </w:tabs>
+        <w:ind w:left="2880" w:hanging="360"/>
+      </w:pPr>
+      <w:rPr>
+        <w:rFonts w:ascii="Wingdings" w:hAnsi="Wingdings" w:hint="default"/>
+        <w:sz w:val="20"/>
+      </w:rPr>
+    </w:lvl>
+    <w:lvl w:ilvl="4" w:tentative="1">
+      <w:start w:val="1"/>
+      <w:numFmt w:val="bullet"/>
+      <w:lvlText w:val=""/>
+      <w:lvlJc w:val="left"/>
+      <w:pPr>
+        <w:tabs>
+          <w:tab w:val="num" w:pos="3600"/>
+        </w:tabs>
+        <w:ind w:left="3600" w:hanging="360"/>
+      </w:pPr>
+      <w:rPr>
+        <w:rFonts w:ascii="Wingdings" w:hAnsi="Wingdings" w:hint="default"/>
+        <w:sz w:val="20"/>
+      </w:rPr>
+    </w:lvl>
+    <w:lvl w:ilvl="5" w:tentative="1">
+      <w:start w:val="1"/>
+      <w:numFmt w:val="bullet"/>
+      <w:lvlText w:val=""/>
+      <w:lvlJc w:val="left"/>
+      <w:pPr>
+        <w:tabs>
+          <w:tab w:val="num" w:pos="4320"/>
+        </w:tabs>
+        <w:ind w:left="4320" w:hanging="360"/>
+      </w:pPr>
+      <w:rPr>
+        <w:rFonts w:ascii="Wingdings" w:hAnsi="Wingdings" w:hint="default"/>
+        <w:sz w:val="20"/>
+      </w:rPr>
+    </w:lvl>
+    <w:lvl w:ilvl="6" w:tentative="1">
+      <w:start w:val="1"/>
+      <w:numFmt w:val="bullet"/>
+      <w:lvlText w:val=""/>
+      <w:lvlJc w:val="left"/>
+      <w:pPr>
+        <w:tabs>
+          <w:tab w:val="num" w:pos="5040"/>
+        </w:tabs>
+        <w:ind w:left="5040" w:hanging="360"/>
+      </w:pPr>
+      <w:rPr>
+        <w:rFonts w:ascii="Wingdings" w:hAnsi="Wingdings" w:hint="default"/>
+        <w:sz w:val="20"/>
+      </w:rPr>
+    </w:lvl>
+    <w:lvl w:ilvl="7" w:tentative="1">
+      <w:start w:val="1"/>
+      <w:numFmt w:val="bullet"/>
+      <w:lvlText w:val=""/>
+      <w:lvlJc w:val="left"/>
+      <w:pPr>
+        <w:tabs>
+          <w:tab w:val="num" w:pos="5760"/>
+        </w:tabs>
+        <w:ind w:left="5760" w:hanging="360"/>
+      </w:pPr>
+      <w:rPr>
+        <w:rFonts w:ascii="Wingdings" w:hAnsi="Wingdings" w:hint="default"/>
+        <w:sz w:val="20"/>
+      </w:rPr>
+    </w:lvl>
+    <w:lvl w:ilvl="8" w:tentative="1">
+      <w:start w:val="1"/>
+      <w:numFmt w:val="bullet"/>
+      <w:lvlText w:val=""/>
+      <w:lvlJc w:val="left"/>
+      <w:pPr>
+        <w:tabs>
+          <w:tab w:val="num" w:pos="6480"/>
+        </w:tabs>
+        <w:ind w:left="6480" w:hanging="360"/>
+      </w:pPr>
+      <w:rPr>
+        <w:rFonts w:ascii="Wingdings" w:hAnsi="Wingdings" w:hint="default"/>
+        <w:sz w:val="20"/>
+      </w:rPr>
+    </w:lvl>
+  </w:abstractNum>
+  <w:abstractNum w:abstractNumId="1" w15:restartNumberingAfterBreak="0">
     <w:nsid w:val="051E0BC9"/>
     <w:multiLevelType w:val="multilevel"/>
     <w:tmpl w:val="8B442F24"/>
@@ -5325,7 +5980,7 @@
       </w:rPr>
     </w:lvl>
   </w:abstractNum>
-  <w:abstractNum w:abstractNumId="1" w15:restartNumberingAfterBreak="0">
+  <w:abstractNum w:abstractNumId="2" w15:restartNumberingAfterBreak="0">
     <w:nsid w:val="065D5A11"/>
     <w:multiLevelType w:val="multilevel"/>
     <w:tmpl w:val="1CAEB324"/>
@@ -5474,7 +6129,7 @@
       </w:rPr>
     </w:lvl>
   </w:abstractNum>
-  <w:abstractNum w:abstractNumId="2" w15:restartNumberingAfterBreak="0">
+  <w:abstractNum w:abstractNumId="3" w15:restartNumberingAfterBreak="0">
     <w:nsid w:val="1226611B"/>
     <w:multiLevelType w:val="multilevel"/>
     <w:tmpl w:val="3DAA17FC"/>
@@ -5623,7 +6278,7 @@
       </w:rPr>
     </w:lvl>
   </w:abstractNum>
-  <w:abstractNum w:abstractNumId="3" w15:restartNumberingAfterBreak="0">
+  <w:abstractNum w:abstractNumId="4" w15:restartNumberingAfterBreak="0">
     <w:nsid w:val="1440105A"/>
     <w:multiLevelType w:val="hybridMultilevel"/>
     <w:tmpl w:val="B7586072"/>
@@ -5736,7 +6391,7 @@
       </w:rPr>
     </w:lvl>
   </w:abstractNum>
-  <w:abstractNum w:abstractNumId="4" w15:restartNumberingAfterBreak="0">
+  <w:abstractNum w:abstractNumId="5" w15:restartNumberingAfterBreak="0">
     <w:nsid w:val="2B034F11"/>
     <w:multiLevelType w:val="hybridMultilevel"/>
     <w:tmpl w:val="1FBE0986"/>
@@ -5849,7 +6504,7 @@
       </w:rPr>
     </w:lvl>
   </w:abstractNum>
-  <w:abstractNum w:abstractNumId="5" w15:restartNumberingAfterBreak="0">
+  <w:abstractNum w:abstractNumId="6" w15:restartNumberingAfterBreak="0">
     <w:nsid w:val="2BF179F9"/>
     <w:multiLevelType w:val="hybridMultilevel"/>
     <w:tmpl w:val="A05A3AEE"/>
@@ -5939,7 +6594,7 @@
       </w:pPr>
     </w:lvl>
   </w:abstractNum>
-  <w:abstractNum w:abstractNumId="6" w15:restartNumberingAfterBreak="0">
+  <w:abstractNum w:abstractNumId="7" w15:restartNumberingAfterBreak="0">
     <w:nsid w:val="32702AA5"/>
     <w:multiLevelType w:val="hybridMultilevel"/>
     <w:tmpl w:val="48463DCE"/>
@@ -6025,7 +6680,7 @@
       </w:pPr>
     </w:lvl>
   </w:abstractNum>
-  <w:abstractNum w:abstractNumId="7" w15:restartNumberingAfterBreak="0">
+  <w:abstractNum w:abstractNumId="8" w15:restartNumberingAfterBreak="0">
     <w:nsid w:val="33CB3C4F"/>
     <w:multiLevelType w:val="multilevel"/>
     <w:tmpl w:val="AA2A9A92"/>
@@ -6174,7 +6829,7 @@
       </w:rPr>
     </w:lvl>
   </w:abstractNum>
-  <w:abstractNum w:abstractNumId="8" w15:restartNumberingAfterBreak="0">
+  <w:abstractNum w:abstractNumId="9" w15:restartNumberingAfterBreak="0">
     <w:nsid w:val="35BB7BE8"/>
     <w:multiLevelType w:val="multilevel"/>
     <w:tmpl w:val="693A70B6"/>
@@ -6287,7 +6942,7 @@
       </w:pPr>
     </w:lvl>
   </w:abstractNum>
-  <w:abstractNum w:abstractNumId="9" w15:restartNumberingAfterBreak="0">
+  <w:abstractNum w:abstractNumId="10" w15:restartNumberingAfterBreak="0">
     <w:nsid w:val="419A6FAD"/>
     <w:multiLevelType w:val="hybridMultilevel"/>
     <w:tmpl w:val="0E24D83E"/>
@@ -6400,7 +7055,7 @@
       </w:rPr>
     </w:lvl>
   </w:abstractNum>
-  <w:abstractNum w:abstractNumId="10" w15:restartNumberingAfterBreak="0">
+  <w:abstractNum w:abstractNumId="11" w15:restartNumberingAfterBreak="0">
     <w:nsid w:val="4A0B5164"/>
     <w:multiLevelType w:val="hybridMultilevel"/>
     <w:tmpl w:val="A9406B60"/>
@@ -6513,7 +7168,7 @@
       </w:rPr>
     </w:lvl>
   </w:abstractNum>
-  <w:abstractNum w:abstractNumId="11" w15:restartNumberingAfterBreak="0">
+  <w:abstractNum w:abstractNumId="12" w15:restartNumberingAfterBreak="0">
     <w:nsid w:val="4D00C9D5"/>
     <w:multiLevelType w:val="hybridMultilevel"/>
     <w:tmpl w:val="9A321FDE"/>
@@ -6626,7 +7281,7 @@
       </w:rPr>
     </w:lvl>
   </w:abstractNum>
-  <w:abstractNum w:abstractNumId="12" w15:restartNumberingAfterBreak="0">
+  <w:abstractNum w:abstractNumId="13" w15:restartNumberingAfterBreak="0">
     <w:nsid w:val="52AF3966"/>
     <w:multiLevelType w:val="multilevel"/>
     <w:tmpl w:val="69DEFDD8"/>
@@ -6771,7 +7426,156 @@
       </w:rPr>
     </w:lvl>
   </w:abstractNum>
-  <w:abstractNum w:abstractNumId="13" w15:restartNumberingAfterBreak="0">
+  <w:abstractNum w:abstractNumId="14" w15:restartNumberingAfterBreak="0">
+    <w:nsid w:val="577852BC"/>
+    <w:multiLevelType w:val="multilevel"/>
+    <w:tmpl w:val="8B2448BE"/>
+    <w:lvl w:ilvl="0">
+      <w:start w:val="1"/>
+      <w:numFmt w:val="bullet"/>
+      <w:lvlText w:val=""/>
+      <w:lvlJc w:val="left"/>
+      <w:pPr>
+        <w:tabs>
+          <w:tab w:val="num" w:pos="720"/>
+        </w:tabs>
+        <w:ind w:left="720" w:hanging="360"/>
+      </w:pPr>
+      <w:rPr>
+        <w:rFonts w:ascii="Symbol" w:hAnsi="Symbol" w:hint="default"/>
+        <w:sz w:val="20"/>
+      </w:rPr>
+    </w:lvl>
+    <w:lvl w:ilvl="1" w:tentative="1">
+      <w:start w:val="1"/>
+      <w:numFmt w:val="bullet"/>
+      <w:lvlText w:val="o"/>
+      <w:lvlJc w:val="left"/>
+      <w:pPr>
+        <w:tabs>
+          <w:tab w:val="num" w:pos="1440"/>
+        </w:tabs>
+        <w:ind w:left="1440" w:hanging="360"/>
+      </w:pPr>
+      <w:rPr>
+        <w:rFonts w:ascii="Courier New" w:hAnsi="Courier New" w:hint="default"/>
+        <w:sz w:val="20"/>
+      </w:rPr>
+    </w:lvl>
+    <w:lvl w:ilvl="2" w:tentative="1">
+      <w:start w:val="1"/>
+      <w:numFmt w:val="bullet"/>
+      <w:lvlText w:val=""/>
+      <w:lvlJc w:val="left"/>
+      <w:pPr>
+        <w:tabs>
+          <w:tab w:val="num" w:pos="2160"/>
+        </w:tabs>
+        <w:ind w:left="2160" w:hanging="360"/>
+      </w:pPr>
+      <w:rPr>
+        <w:rFonts w:ascii="Wingdings" w:hAnsi="Wingdings" w:hint="default"/>
+        <w:sz w:val="20"/>
+      </w:rPr>
+    </w:lvl>
+    <w:lvl w:ilvl="3" w:tentative="1">
+      <w:start w:val="1"/>
+      <w:numFmt w:val="bullet"/>
+      <w:lvlText w:val=""/>
+      <w:lvlJc w:val="left"/>
+      <w:pPr>
+        <w:tabs>
+          <w:tab w:val="num" w:pos="2880"/>
+        </w:tabs>
+        <w:ind w:left="2880" w:hanging="360"/>
+      </w:pPr>
+      <w:rPr>
+        <w:rFonts w:ascii="Wingdings" w:hAnsi="Wingdings" w:hint="default"/>
+        <w:sz w:val="20"/>
+      </w:rPr>
+    </w:lvl>
+    <w:lvl w:ilvl="4" w:tentative="1">
+      <w:start w:val="1"/>
+      <w:numFmt w:val="bullet"/>
+      <w:lvlText w:val=""/>
+      <w:lvlJc w:val="left"/>
+      <w:pPr>
+        <w:tabs>
+          <w:tab w:val="num" w:pos="3600"/>
+        </w:tabs>
+        <w:ind w:left="3600" w:hanging="360"/>
+      </w:pPr>
+      <w:rPr>
+        <w:rFonts w:ascii="Wingdings" w:hAnsi="Wingdings" w:hint="default"/>
+        <w:sz w:val="20"/>
+      </w:rPr>
+    </w:lvl>
+    <w:lvl w:ilvl="5" w:tentative="1">
+      <w:start w:val="1"/>
+      <w:numFmt w:val="bullet"/>
+      <w:lvlText w:val=""/>
+      <w:lvlJc w:val="left"/>
+      <w:pPr>
+        <w:tabs>
+          <w:tab w:val="num" w:pos="4320"/>
+        </w:tabs>
+        <w:ind w:left="4320" w:hanging="360"/>
+      </w:pPr>
+      <w:rPr>
+        <w:rFonts w:ascii="Wingdings" w:hAnsi="Wingdings" w:hint="default"/>
+        <w:sz w:val="20"/>
+      </w:rPr>
+    </w:lvl>
+    <w:lvl w:ilvl="6" w:tentative="1">
+      <w:start w:val="1"/>
+      <w:numFmt w:val="bullet"/>
+      <w:lvlText w:val=""/>
+      <w:lvlJc w:val="left"/>
+      <w:pPr>
+        <w:tabs>
+          <w:tab w:val="num" w:pos="5040"/>
+        </w:tabs>
+        <w:ind w:left="5040" w:hanging="360"/>
+      </w:pPr>
+      <w:rPr>
+        <w:rFonts w:ascii="Wingdings" w:hAnsi="Wingdings" w:hint="default"/>
+        <w:sz w:val="20"/>
+      </w:rPr>
+    </w:lvl>
+    <w:lvl w:ilvl="7" w:tentative="1">
+      <w:start w:val="1"/>
+      <w:numFmt w:val="bullet"/>
+      <w:lvlText w:val=""/>
+      <w:lvlJc w:val="left"/>
+      <w:pPr>
+        <w:tabs>
+          <w:tab w:val="num" w:pos="5760"/>
+        </w:tabs>
+        <w:ind w:left="5760" w:hanging="360"/>
+      </w:pPr>
+      <w:rPr>
+        <w:rFonts w:ascii="Wingdings" w:hAnsi="Wingdings" w:hint="default"/>
+        <w:sz w:val="20"/>
+      </w:rPr>
+    </w:lvl>
+    <w:lvl w:ilvl="8" w:tentative="1">
+      <w:start w:val="1"/>
+      <w:numFmt w:val="bullet"/>
+      <w:lvlText w:val=""/>
+      <w:lvlJc w:val="left"/>
+      <w:pPr>
+        <w:tabs>
+          <w:tab w:val="num" w:pos="6480"/>
+        </w:tabs>
+        <w:ind w:left="6480" w:hanging="360"/>
+      </w:pPr>
+      <w:rPr>
+        <w:rFonts w:ascii="Wingdings" w:hAnsi="Wingdings" w:hint="default"/>
+        <w:sz w:val="20"/>
+      </w:rPr>
+    </w:lvl>
+  </w:abstractNum>
+  <w:abstractNum w:abstractNumId="15" w15:restartNumberingAfterBreak="0">
     <w:nsid w:val="62022EF5"/>
     <w:multiLevelType w:val="multilevel"/>
     <w:tmpl w:val="6C624254"/>
@@ -6884,7 +7688,7 @@
       </w:pPr>
     </w:lvl>
   </w:abstractNum>
-  <w:abstractNum w:abstractNumId="14" w15:restartNumberingAfterBreak="0">
+  <w:abstractNum w:abstractNumId="16" w15:restartNumberingAfterBreak="0">
     <w:nsid w:val="69D15638"/>
     <w:multiLevelType w:val="hybridMultilevel"/>
     <w:tmpl w:val="E2CA0956"/>
@@ -6997,7 +7801,7 @@
       </w:rPr>
     </w:lvl>
   </w:abstractNum>
-  <w:abstractNum w:abstractNumId="15" w15:restartNumberingAfterBreak="0">
+  <w:abstractNum w:abstractNumId="17" w15:restartNumberingAfterBreak="0">
     <w:nsid w:val="6A2F6300"/>
     <w:multiLevelType w:val="multilevel"/>
     <w:tmpl w:val="63B814BE"/>
@@ -7146,7 +7950,7 @@
       </w:rPr>
     </w:lvl>
   </w:abstractNum>
-  <w:abstractNum w:abstractNumId="16" w15:restartNumberingAfterBreak="0">
+  <w:abstractNum w:abstractNumId="18" w15:restartNumberingAfterBreak="0">
     <w:nsid w:val="6BE20DCE"/>
     <w:multiLevelType w:val="multilevel"/>
     <w:tmpl w:val="A0F098F8"/>
@@ -7295,7 +8099,7 @@
       </w:rPr>
     </w:lvl>
   </w:abstractNum>
-  <w:abstractNum w:abstractNumId="17" w15:restartNumberingAfterBreak="0">
+  <w:abstractNum w:abstractNumId="19" w15:restartNumberingAfterBreak="0">
     <w:nsid w:val="6D343EFD"/>
     <w:multiLevelType w:val="hybridMultilevel"/>
     <w:tmpl w:val="A3C2C190"/>
@@ -7384,7 +8188,7 @@
       </w:pPr>
     </w:lvl>
   </w:abstractNum>
-  <w:abstractNum w:abstractNumId="18" w15:restartNumberingAfterBreak="0">
+  <w:abstractNum w:abstractNumId="20" w15:restartNumberingAfterBreak="0">
     <w:nsid w:val="73E61F88"/>
     <w:multiLevelType w:val="multilevel"/>
     <w:tmpl w:val="C77C5E24"/>
@@ -7533,7 +8337,7 @@
       </w:rPr>
     </w:lvl>
   </w:abstractNum>
-  <w:abstractNum w:abstractNumId="19" w15:restartNumberingAfterBreak="0">
+  <w:abstractNum w:abstractNumId="21" w15:restartNumberingAfterBreak="0">
     <w:nsid w:val="7A9045D8"/>
     <w:multiLevelType w:val="multilevel"/>
     <w:tmpl w:val="4762DB68"/>
@@ -7682,71 +8486,77 @@
       </w:rPr>
     </w:lvl>
   </w:abstractNum>
-  <w:num w:numId="1" w16cid:durableId="983312131">
+  <w:num w:numId="1">
+    <w:abstractNumId w:val="12"/>
+  </w:num>
+  <w:num w:numId="2">
+    <w:abstractNumId w:val="13"/>
+  </w:num>
+  <w:num w:numId="3">
+    <w:abstractNumId w:val="4"/>
+  </w:num>
+  <w:num w:numId="4">
+    <w:abstractNumId w:val="16"/>
+  </w:num>
+  <w:num w:numId="5">
+    <w:abstractNumId w:val="9"/>
+  </w:num>
+  <w:num w:numId="6">
+    <w:abstractNumId w:val="21"/>
+  </w:num>
+  <w:num w:numId="7">
+    <w:abstractNumId w:val="7"/>
+  </w:num>
+  <w:num w:numId="8">
+    <w:abstractNumId w:val="6"/>
+  </w:num>
+  <w:num w:numId="9">
+    <w:abstractNumId w:val="5"/>
+  </w:num>
+  <w:num w:numId="10">
+    <w:abstractNumId w:val="10"/>
+  </w:num>
+  <w:num w:numId="11">
+    <w:abstractNumId w:val="19"/>
+  </w:num>
+  <w:num w:numId="12">
+    <w:abstractNumId w:val="18"/>
+  </w:num>
+  <w:num w:numId="13">
+    <w:abstractNumId w:val="20"/>
+  </w:num>
+  <w:num w:numId="14">
     <w:abstractNumId w:val="11"/>
   </w:num>
-  <w:num w:numId="2" w16cid:durableId="376204260">
-    <w:abstractNumId w:val="12"/>
+  <w:num w:numId="15">
+    <w:abstractNumId w:val="15"/>
   </w:num>
-  <w:num w:numId="3" w16cid:durableId="268777499">
+  <w:num w:numId="16">
+    <w:abstractNumId w:val="17"/>
+  </w:num>
+  <w:num w:numId="17">
+    <w:abstractNumId w:val="8"/>
+  </w:num>
+  <w:num w:numId="18">
+    <w:abstractNumId w:val="1"/>
+  </w:num>
+  <w:num w:numId="19">
+    <w:abstractNumId w:val="2"/>
+  </w:num>
+  <w:num w:numId="20">
     <w:abstractNumId w:val="3"/>
   </w:num>
-  <w:num w:numId="4" w16cid:durableId="1243837183">
+  <w:num w:numId="21">
     <w:abstractNumId w:val="14"/>
   </w:num>
-  <w:num w:numId="5" w16cid:durableId="1076364463">
-    <w:abstractNumId w:val="8"/>
-  </w:num>
-  <w:num w:numId="6" w16cid:durableId="1514761357">
-    <w:abstractNumId w:val="19"/>
-  </w:num>
-  <w:num w:numId="7" w16cid:durableId="1584800961">
-    <w:abstractNumId w:val="6"/>
-  </w:num>
-  <w:num w:numId="8" w16cid:durableId="892229810">
-    <w:abstractNumId w:val="5"/>
-  </w:num>
-  <w:num w:numId="9" w16cid:durableId="663433947">
-    <w:abstractNumId w:val="4"/>
-  </w:num>
-  <w:num w:numId="10" w16cid:durableId="1437674711">
-    <w:abstractNumId w:val="9"/>
-  </w:num>
-  <w:num w:numId="11" w16cid:durableId="623075749">
-    <w:abstractNumId w:val="17"/>
-  </w:num>
-  <w:num w:numId="12" w16cid:durableId="1144155984">
-    <w:abstractNumId w:val="16"/>
-  </w:num>
-  <w:num w:numId="13" w16cid:durableId="1259024071">
-    <w:abstractNumId w:val="18"/>
-  </w:num>
-  <w:num w:numId="14" w16cid:durableId="292176671">
-    <w:abstractNumId w:val="10"/>
-  </w:num>
-  <w:num w:numId="15" w16cid:durableId="122626808">
-    <w:abstractNumId w:val="13"/>
-  </w:num>
-  <w:num w:numId="16" w16cid:durableId="915550696">
-    <w:abstractNumId w:val="15"/>
-  </w:num>
-  <w:num w:numId="17" w16cid:durableId="585655110">
-    <w:abstractNumId w:val="7"/>
-  </w:num>
-  <w:num w:numId="18" w16cid:durableId="2048098131">
+  <w:num w:numId="22">
     <w:abstractNumId w:val="0"/>
-  </w:num>
-  <w:num w:numId="19" w16cid:durableId="251399817">
-    <w:abstractNumId w:val="1"/>
-  </w:num>
-  <w:num w:numId="20" w16cid:durableId="1251618179">
-    <w:abstractNumId w:val="2"/>
   </w:num>
 </w:numbering>
 </file>
 
 <file path=word/styles.xml><?xml version="1.0" encoding="utf-8"?>
-<w:styles xmlns:mc="http://schemas.openxmlformats.org/markup-compatibility/2006" xmlns:r="http://schemas.openxmlformats.org/officeDocument/2006/relationships" xmlns:w="http://schemas.openxmlformats.org/wordprocessingml/2006/main" xmlns:w14="http://schemas.microsoft.com/office/word/2010/wordml" xmlns:w15="http://schemas.microsoft.com/office/word/2012/wordml" xmlns:w16cex="http://schemas.microsoft.com/office/word/2018/wordml/cex" xmlns:w16cid="http://schemas.microsoft.com/office/word/2016/wordml/cid" xmlns:w16="http://schemas.microsoft.com/office/word/2018/wordml" xmlns:w16du="http://schemas.microsoft.com/office/word/2023/wordml/word16du" xmlns:w16sdtdh="http://schemas.microsoft.com/office/word/2020/wordml/sdtdatahash" xmlns:w16sdtfl="http://schemas.microsoft.com/office/word/2024/wordml/sdtformatlock" xmlns:w16se="http://schemas.microsoft.com/office/word/2015/wordml/symex" mc:Ignorable="w14 w15 w16se w16cid w16 w16cex w16sdtdh w16sdtfl w16du">
+<w:styles xmlns:mc="http://schemas.openxmlformats.org/markup-compatibility/2006" xmlns:r="http://schemas.openxmlformats.org/officeDocument/2006/relationships" xmlns:w="http://schemas.openxmlformats.org/wordprocessingml/2006/main" xmlns:w14="http://schemas.microsoft.com/office/word/2010/wordml" xmlns:w15="http://schemas.microsoft.com/office/word/2012/wordml" xmlns:w16cex="http://schemas.microsoft.com/office/word/2018/wordml/cex" xmlns:w16cid="http://schemas.microsoft.com/office/word/2016/wordml/cid" xmlns:w16="http://schemas.microsoft.com/office/word/2018/wordml" xmlns:w16sdtdh="http://schemas.microsoft.com/office/word/2020/wordml/sdtdatahash" xmlns:w16se="http://schemas.microsoft.com/office/word/2015/wordml/symex" mc:Ignorable="w14 w15 w16se w16cid w16 w16cex w16sdtdh">
   <w:docDefaults>
     <w:rPrDefault>
       <w:rPr>
@@ -8346,6 +9156,7 @@
   <w:style w:type="character" w:default="1" w:styleId="DefaultParagraphFont">
     <w:name w:val="Default Paragraph Font"/>
     <w:uiPriority w:val="1"/>
+    <w:semiHidden/>
     <w:unhideWhenUsed/>
   </w:style>
   <w:style w:type="table" w:default="1" w:styleId="TableNormal">
@@ -8808,7 +9619,6 @@
     <w:name w:val="Normal (Web)"/>
     <w:basedOn w:val="Normal"/>
     <w:uiPriority w:val="99"/>
-    <w:semiHidden/>
     <w:unhideWhenUsed/>
     <w:rsid w:val="004143FA"/>
     <w:pPr>
@@ -8935,6 +9745,31 @@
         <w:insideV w:val="single" w:sz="4" w:space="0" w:color="BFBFBF" w:themeColor="background1" w:themeShade="BF"/>
       </w:tblBorders>
     </w:tblPr>
+  </w:style>
+  <w:style w:type="character" w:customStyle="1" w:styleId="citation-198">
+    <w:name w:val="citation-198"/>
+    <w:basedOn w:val="DefaultParagraphFont"/>
+    <w:rsid w:val="004A7DB2"/>
+  </w:style>
+  <w:style w:type="character" w:customStyle="1" w:styleId="citation-227">
+    <w:name w:val="citation-227"/>
+    <w:basedOn w:val="DefaultParagraphFont"/>
+    <w:rsid w:val="004A7DB2"/>
+  </w:style>
+  <w:style w:type="character" w:customStyle="1" w:styleId="citation-226">
+    <w:name w:val="citation-226"/>
+    <w:basedOn w:val="DefaultParagraphFont"/>
+    <w:rsid w:val="004A7DB2"/>
+  </w:style>
+  <w:style w:type="character" w:customStyle="1" w:styleId="citation-225">
+    <w:name w:val="citation-225"/>
+    <w:basedOn w:val="DefaultParagraphFont"/>
+    <w:rsid w:val="004A7DB2"/>
+  </w:style>
+  <w:style w:type="character" w:customStyle="1" w:styleId="citation-224">
+    <w:name w:val="citation-224"/>
+    <w:basedOn w:val="DefaultParagraphFont"/>
+    <w:rsid w:val="004A7DB2"/>
   </w:style>
 </w:styles>
 </file>

</xml_diff>